<commit_message>
Contestação Douglas da Silva: ajustes após retorno do advogado
- Tempestividade: indica as Portarias do TRT-4 de suspensão em 21/09
  (GP.TRT4 nº 2.019/2026) e 28/09 (nº 2.075/2026), com conferência de número.
- Citação por Domicílio Eletrônico sem efeito: a empresa não tem cadastro;
  única citação válida é a postal de 14/09/2026.
- PIX admitidos como pagamento por empreitada/tarefa; sem relatório
  financeiro; data inicial comprovada 19/06/2026 fixada nas subsidiárias.
- Zeiso desconhecido da Reclamada; sem proposta de acordo.
- Retiradas as marcações de conferência já validadas.

Co-Authored-By: Claude Opus 5.5 <noreply@anthropic.com>
Claude-Session: https://claude.ai/code/session_013uFN8zGBemQT4Q4ajQDqg6
</commit_message>
<xml_diff>
--- a/pecas/BS x DOUGLAS DA SILVA - CONTESTACAO.docx
+++ b/pecas/BS x DOUGLAS DA SILVA - CONTESTACAO.docx
@@ -118,45 +118,7 @@
           <w:i w:val="0"/>
           <w:sz w:val="24"/>
         </w:rPr>
-        <w:t xml:space="preserve">, brasileiro, solteiro, empresário, portador da cédula de identidade nº 6104303117 SSP/RS, inscrito no CPF sob nº 019.699.180-39 </w:t>
-      </w:r>
-      <w:r>
-        <w:rPr>
-          <w:rFonts w:ascii="Times New Roman" w:hAnsi="Times New Roman" w:cs="Times New Roman"/>
-          <w:b w:val="0"/>
-          <w:i w:val="0"/>
-          <w:color w:val="FF0000"/>
-          <w:sz w:val="24"/>
-        </w:rPr>
-        <w:t>[CONFERIR QUALIFICAÇÃO NO CONTRATO SOCIAL ATUALIZADO]</w:t>
-      </w:r>
-      <w:r>
-        <w:rPr>
-          <w:rFonts w:ascii="Times New Roman" w:hAnsi="Times New Roman" w:cs="Times New Roman"/>
-          <w:b w:val="0"/>
-          <w:i w:val="0"/>
-          <w:sz w:val="24"/>
-        </w:rPr>
-        <w:t xml:space="preserve">, por seu advogado infra-assinado, com instrumento de procuração anexo </w:t>
-      </w:r>
-      <w:r>
-        <w:rPr>
-          <w:rFonts w:ascii="Times New Roman" w:hAnsi="Times New Roman" w:cs="Times New Roman"/>
-          <w:b w:val="0"/>
-          <w:i w:val="0"/>
-          <w:color w:val="FF0000"/>
-          <w:sz w:val="24"/>
-        </w:rPr>
-        <w:t>[doc. anexo — CONFIRMAR JUNTADA COM A HABILITAÇÃO DE ID af57a21]</w:t>
-      </w:r>
-      <w:r>
-        <w:rPr>
-          <w:rFonts w:ascii="Times New Roman" w:hAnsi="Times New Roman" w:cs="Times New Roman"/>
-          <w:b w:val="0"/>
-          <w:i w:val="0"/>
-          <w:sz w:val="24"/>
-        </w:rPr>
-        <w:t>, vem, mui respeitosamente, à presença de Vossa Excelência, tempestivamente, com fundamento no art. 847 da CLT e demais dispositivos aplicáveis, apresentar</w:t>
+        <w:t>, brasileiro, solteiro, empresário, portador da cédula de identidade nº 6104303117 SSP/RS, inscrito no CPF sob nº 019.699.180-39, por seu advogado infra-assinado, com instrumento de procuração anexo, vem, mui respeitosamente, à presença de Vossa Excelência, tempestivamente, com fundamento no art. 847 da CLT e demais dispositivos aplicáveis, apresentar</w:t>
       </w:r>
     </w:p>
     <w:p/>
@@ -267,7 +229,7 @@
           <w:i w:val="0"/>
           <w:sz w:val="24"/>
         </w:rPr>
-        <w:t>serviços determinados</w:t>
+        <w:t>serviços determinados, por empreitada ou tarefa</w:t>
       </w:r>
       <w:r>
         <w:rPr>
@@ -285,7 +247,7 @@
           <w:i w:val="0"/>
           <w:sz w:val="24"/>
         </w:rPr>
-        <w:t>por serviço</w:t>
+        <w:t>pelo serviço executado</w:t>
       </w:r>
       <w:r>
         <w:rPr>
@@ -330,17 +292,7 @@
           <w:i w:val="0"/>
           <w:sz w:val="24"/>
         </w:rPr>
-        <w:t xml:space="preserve"> (ID 866c5c6, fls. 18 e 19). </w:t>
-      </w:r>
-      <w:r>
-        <w:rPr>
-          <w:rFonts w:ascii="Times New Roman" w:hAnsi="Times New Roman" w:cs="Times New Roman"/>
-          <w:b w:val="0"/>
-          <w:i w:val="0"/>
-          <w:color w:val="FF0000"/>
-          <w:sz w:val="24"/>
-        </w:rPr>
-        <w:t>[CONFIRMAR COM O CLIENTE: natureza dos serviços remunerados, datas em que foram prestados e se houve outros pagamentos ao Reclamante]</w:t>
+        <w:t xml:space="preserve"> (ID 866c5c6, fls. 18 e 19).</w:t>
       </w:r>
     </w:p>
     <w:p/>
@@ -512,17 +464,35 @@
           <w:i w:val="0"/>
           <w:sz w:val="24"/>
         </w:rPr>
-        <w:t xml:space="preserve">, em que não houve fluência de prazos processuais </w:t>
+        <w:t xml:space="preserve">, em que não houve fluência de prazos processuais — por força da </w:t>
+      </w:r>
+      <w:r>
+        <w:rPr>
+          <w:rFonts w:ascii="Times New Roman" w:hAnsi="Times New Roman" w:cs="Times New Roman"/>
+          <w:b/>
+          <w:i w:val="0"/>
+          <w:sz w:val="24"/>
+        </w:rPr>
+        <w:t>Portaria GP.TRT4 nº 2.019/2026</w:t>
       </w:r>
       <w:r>
         <w:rPr>
           <w:rFonts w:ascii="Times New Roman" w:hAnsi="Times New Roman" w:cs="Times New Roman"/>
           <w:b w:val="0"/>
           <w:i w:val="0"/>
+          <w:sz w:val="24"/>
+        </w:rPr>
+        <w:t xml:space="preserve"> </w:t>
+      </w:r>
+      <w:r>
+        <w:rPr>
+          <w:rFonts w:ascii="Times New Roman" w:hAnsi="Times New Roman" w:cs="Times New Roman"/>
+          <w:b w:val="0"/>
+          <w:i w:val="0"/>
           <w:color w:val="FF0000"/>
           <w:sz w:val="24"/>
         </w:rPr>
-        <w:t>[CONFERIR E INDICAR O ATO/PORTARIA DE SUSPENSÃO DOS PRAZOS NOS DIAS 21/09 E 28/09/2026]</w:t>
+        <w:t>[CONFERIR Nº]</w:t>
       </w:r>
       <w:r>
         <w:rPr>
@@ -531,7 +501,44 @@
           <w:i w:val="0"/>
           <w:sz w:val="24"/>
         </w:rPr>
-        <w:t xml:space="preserve">, o termo final recai em </w:t>
+        <w:t xml:space="preserve">, quanto a 21/09/2026, e da </w:t>
+      </w:r>
+      <w:r>
+        <w:rPr>
+          <w:rFonts w:ascii="Times New Roman" w:hAnsi="Times New Roman" w:cs="Times New Roman"/>
+          <w:b/>
+          <w:i w:val="0"/>
+          <w:sz w:val="24"/>
+        </w:rPr>
+        <w:t>Portaria nº 2.075/2026</w:t>
+      </w:r>
+      <w:r>
+        <w:rPr>
+          <w:rFonts w:ascii="Times New Roman" w:hAnsi="Times New Roman" w:cs="Times New Roman"/>
+          <w:b w:val="0"/>
+          <w:i w:val="0"/>
+          <w:sz w:val="24"/>
+        </w:rPr>
+        <w:t xml:space="preserve"> </w:t>
+      </w:r>
+      <w:r>
+        <w:rPr>
+          <w:rFonts w:ascii="Times New Roman" w:hAnsi="Times New Roman" w:cs="Times New Roman"/>
+          <w:b w:val="0"/>
+          <w:i w:val="0"/>
+          <w:color w:val="FF0000"/>
+          <w:sz w:val="24"/>
+        </w:rPr>
+        <w:t>[CONFERIR Nº]</w:t>
+      </w:r>
+      <w:r>
+        <w:rPr>
+          <w:rFonts w:ascii="Times New Roman" w:hAnsi="Times New Roman" w:cs="Times New Roman"/>
+          <w:b w:val="0"/>
+          <w:i w:val="0"/>
+          <w:sz w:val="24"/>
+        </w:rPr>
+        <w:t xml:space="preserve">, quanto a 28/09/2026, ambas da Presidência do TRT da 4ª Região, editadas em razão dos temporais que atingiram o Estado e da consequente indisponibilidade de energia elétrica e de serviços eletrônicos —, o termo final recai em </w:t>
       </w:r>
       <w:r>
         <w:rPr>
@@ -583,7 +590,7 @@
           <w:i w:val="0"/>
           <w:sz w:val="24"/>
         </w:rPr>
-        <w:t xml:space="preserve">Registre-se, por cautela, que a certidão de ID bd90c0b (07/08/2026) noticia confirmação de intimação via Domicílio Eletrônico. O próprio Juízo, contudo, </w:t>
+        <w:t xml:space="preserve">Registre-se que a certidão de ID bd90c0b (07/08/2026), que noticia suposta "ciência" de intimação via Domicílio Eletrônico, </w:t>
       </w:r>
       <w:r>
         <w:rPr>
@@ -592,7 +599,7 @@
           <w:i w:val="0"/>
           <w:sz w:val="24"/>
         </w:rPr>
-        <w:t>determinou posteriormente nova notificação postal</w:t>
+        <w:t>não produz efeito algum</w:t>
       </w:r>
       <w:r>
         <w:rPr>
@@ -601,17 +608,79 @@
           <w:i w:val="0"/>
           <w:sz w:val="24"/>
         </w:rPr>
-        <w:t xml:space="preserve"> (ID 6267628, de 02/09/2026), com prazo expressamente fixado a partir do seu recebimento, o que revela que aquele ato não foi tido como apto a deflagrar o prazo de defesa. A Reclamada pautou-se, de boa-fé, pelo último ato de comunicação expedido pelo Juízo, e não pode ser surpreendida por contagem diversa daquela que o próprio Juízo lhe comunicou (arts. 5º e 10 do CPC c/c art. 769 da CLT; art. 5º, LV, da CF). </w:t>
+        <w:t xml:space="preserve">: a Reclamada </w:t>
+      </w:r>
+      <w:r>
+        <w:rPr>
+          <w:rFonts w:ascii="Times New Roman" w:hAnsi="Times New Roman" w:cs="Times New Roman"/>
+          <w:b/>
+          <w:i w:val="0"/>
+          <w:sz w:val="24"/>
+        </w:rPr>
+        <w:t>não possui cadastro no Domicílio Judicial Eletrônico</w:t>
       </w:r>
       <w:r>
         <w:rPr>
           <w:rFonts w:ascii="Times New Roman" w:hAnsi="Times New Roman" w:cs="Times New Roman"/>
           <w:b w:val="0"/>
           <w:i w:val="0"/>
-          <w:color w:val="FF0000"/>
-          <w:sz w:val="24"/>
-        </w:rPr>
-        <w:t>[CONFERIR COM A SECRETARIA E NO PAINEL DO DOMICÍLIO ELETRÔNICO A NATUREZA DA "CIÊNCIA" DE 07/08/2026 — PONTO DE RISCO DE REVELIA]</w:t>
+          <w:sz w:val="24"/>
+        </w:rPr>
+        <w:t xml:space="preserve">, de modo que não houve recebimento, ciência ou abertura de comunicação por esse meio. Inexistente o cadastro, a citação da pessoa jurídica deve realizar-se pelos meios ordinários — como, aliás, o próprio Juízo reconheceu ao </w:t>
+      </w:r>
+      <w:r>
+        <w:rPr>
+          <w:rFonts w:ascii="Times New Roman" w:hAnsi="Times New Roman" w:cs="Times New Roman"/>
+          <w:b/>
+          <w:i w:val="0"/>
+          <w:sz w:val="24"/>
+        </w:rPr>
+        <w:t>determinar nova notificação, agora postal</w:t>
+      </w:r>
+      <w:r>
+        <w:rPr>
+          <w:rFonts w:ascii="Times New Roman" w:hAnsi="Times New Roman" w:cs="Times New Roman"/>
+          <w:b w:val="0"/>
+          <w:i w:val="0"/>
+          <w:sz w:val="24"/>
+        </w:rPr>
+        <w:t xml:space="preserve"> (ID 6267628, de 02/09/2026), com prazo expressamente fixado </w:t>
+      </w:r>
+      <w:r>
+        <w:rPr>
+          <w:rFonts w:ascii="Times New Roman" w:hAnsi="Times New Roman" w:cs="Times New Roman"/>
+          <w:b/>
+          <w:i w:val="0"/>
+          <w:sz w:val="24"/>
+        </w:rPr>
+        <w:t>"a contar do recebimento"</w:t>
+      </w:r>
+      <w:r>
+        <w:rPr>
+          <w:rFonts w:ascii="Times New Roman" w:hAnsi="Times New Roman" w:cs="Times New Roman"/>
+          <w:b w:val="0"/>
+          <w:i w:val="0"/>
+          <w:sz w:val="24"/>
+        </w:rPr>
+        <w:t xml:space="preserve">. A </w:t>
+      </w:r>
+      <w:r>
+        <w:rPr>
+          <w:rFonts w:ascii="Times New Roman" w:hAnsi="Times New Roman" w:cs="Times New Roman"/>
+          <w:b/>
+          <w:i w:val="0"/>
+          <w:sz w:val="24"/>
+        </w:rPr>
+        <w:t>única citação válida</w:t>
+      </w:r>
+      <w:r>
+        <w:rPr>
+          <w:rFonts w:ascii="Times New Roman" w:hAnsi="Times New Roman" w:cs="Times New Roman"/>
+          <w:b w:val="0"/>
+          <w:i w:val="0"/>
+          <w:sz w:val="24"/>
+        </w:rPr>
+        <w:t xml:space="preserve"> é, portanto, a postal, entregue em 14/09/2026 (art. 841, § 1º, da CLT), e é dela que flui o prazo de defesa (arts. 774 e 775 da CLT; art. 5º, LV, da CF).</w:t>
       </w:r>
     </w:p>
     <w:p/>
@@ -822,7 +891,7 @@
           <w:i w:val="0"/>
           <w:sz w:val="24"/>
         </w:rPr>
-        <w:t>"o rompimento [...] partiu do trabalhador"</w:t>
+        <w:t>"o rompimento (...) partiu do trabalhador"</w:t>
       </w:r>
       <w:r>
         <w:rPr>
@@ -831,7 +900,7 @@
           <w:i w:val="0"/>
           <w:sz w:val="24"/>
         </w:rPr>
-        <w:t xml:space="preserve">. No capítulo 4, confessa que </w:t>
+        <w:t xml:space="preserve">. No capítulo 4, confessa que o desligamento foi </w:t>
       </w:r>
       <w:r>
         <w:rPr>
@@ -840,7 +909,7 @@
           <w:i w:val="0"/>
           <w:sz w:val="24"/>
         </w:rPr>
-        <w:t>"o desligamento [foi] formalizado como pedido de saída"</w:t>
+        <w:t>"formalizado como pedido de saída"</w:t>
       </w:r>
       <w:r>
         <w:rPr>
@@ -1168,7 +1237,7 @@
           <w:i w:val="0"/>
           <w:sz w:val="24"/>
         </w:rPr>
-        <w:t>por serviços pontuais</w:t>
+        <w:t>por empreitada/tarefa</w:t>
       </w:r>
       <w:r>
         <w:rPr>
@@ -1177,26 +1246,7 @@
           <w:i w:val="0"/>
           <w:sz w:val="24"/>
         </w:rPr>
-        <w:t xml:space="preserve"> prestados pelo Reclamante </w:t>
-      </w:r>
-      <w:r>
-        <w:rPr>
-          <w:rFonts w:ascii="Times New Roman" w:hAnsi="Times New Roman" w:cs="Times New Roman"/>
-          <w:b w:val="0"/>
-          <w:i w:val="0"/>
-          <w:color w:val="FF0000"/>
-          <w:sz w:val="24"/>
-        </w:rPr>
-        <w:t>[CONFIRMAR COM O CLIENTE: serviço remunerado em cada pagamento]</w:t>
-      </w:r>
-      <w:r>
-        <w:rPr>
-          <w:rFonts w:ascii="Times New Roman" w:hAnsi="Times New Roman" w:cs="Times New Roman"/>
-          <w:b w:val="0"/>
-          <w:i w:val="0"/>
-          <w:sz w:val="24"/>
-        </w:rPr>
-        <w:t xml:space="preserve">. Impugna, contudo, e com veemência, </w:t>
+        <w:t xml:space="preserve">, isto é, pela remuneração de serviços determinados e pontuais executados pelo Reclamante. Impugna, contudo, e com veemência, </w:t>
       </w:r>
       <w:r>
         <w:rPr>
@@ -1324,7 +1374,7 @@
           <w:i w:val="0"/>
           <w:sz w:val="24"/>
         </w:rPr>
-        <w:t>(c) que os pagamentos eram feitos por serviço, e não por mês.</w:t>
+        <w:t>(c) que os pagamentos eram feitos por empreitada ou tarefa, e não por mês.</w:t>
       </w:r>
       <w:r>
         <w:rPr>
@@ -1455,26 +1505,25 @@
           <w:i w:val="0"/>
           <w:sz w:val="24"/>
         </w:rPr>
-        <w:t xml:space="preserve"> — pessoa que a inicial sequer nomeia ou vincula à Reclamada </w:t>
+        <w:t xml:space="preserve"> — pessoa </w:t>
+      </w:r>
+      <w:r>
+        <w:rPr>
+          <w:rFonts w:ascii="Times New Roman" w:hAnsi="Times New Roman" w:cs="Times New Roman"/>
+          <w:b/>
+          <w:i w:val="0"/>
+          <w:sz w:val="24"/>
+        </w:rPr>
+        <w:t>desconhecida da Reclamada</w:t>
       </w:r>
       <w:r>
         <w:rPr>
           <w:rFonts w:ascii="Times New Roman" w:hAnsi="Times New Roman" w:cs="Times New Roman"/>
           <w:b w:val="0"/>
           <w:i w:val="0"/>
-          <w:color w:val="FF0000"/>
-          <w:sz w:val="24"/>
-        </w:rPr>
-        <w:t>[CONFIRMAR COM O CLIENTE: quem é "Zeiso"]</w:t>
-      </w:r>
-      <w:r>
-        <w:rPr>
-          <w:rFonts w:ascii="Times New Roman" w:hAnsi="Times New Roman" w:cs="Times New Roman"/>
-          <w:b w:val="0"/>
-          <w:i w:val="0"/>
-          <w:sz w:val="24"/>
-        </w:rPr>
-        <w:t xml:space="preserve"> —, composta quase integralmente por </w:t>
+          <w:sz w:val="24"/>
+        </w:rPr>
+        <w:t xml:space="preserve">, que a inicial sequer nomeia ou vincula à empresa e que não integra o seu quadro —, composta quase integralmente por </w:t>
       </w:r>
       <w:r>
         <w:rPr>
@@ -1749,44 +1798,7 @@
           <w:i w:val="0"/>
           <w:sz w:val="24"/>
         </w:rPr>
-        <w:t xml:space="preserve">. Peças de identificação visual são entregues a quem ingressa nas frentes de serviço por razões de </w:t>
-      </w:r>
-      <w:r>
-        <w:rPr>
-          <w:rFonts w:ascii="Times New Roman" w:hAnsi="Times New Roman" w:cs="Times New Roman"/>
-          <w:b/>
-          <w:i w:val="0"/>
-          <w:sz w:val="24"/>
-        </w:rPr>
-        <w:t>identificação, controle de acesso e segurança</w:t>
-      </w:r>
-      <w:r>
-        <w:rPr>
-          <w:rFonts w:ascii="Times New Roman" w:hAnsi="Times New Roman" w:cs="Times New Roman"/>
-          <w:b w:val="0"/>
-          <w:i w:val="0"/>
-          <w:sz w:val="24"/>
-        </w:rPr>
-        <w:t xml:space="preserve"> — inclusive a prestadores pontuais e a terceiros —, e sua posse não prova contratação, salário, jornada ou subordinação </w:t>
-      </w:r>
-      <w:r>
-        <w:rPr>
-          <w:rFonts w:ascii="Times New Roman" w:hAnsi="Times New Roman" w:cs="Times New Roman"/>
-          <w:b w:val="0"/>
-          <w:i w:val="0"/>
-          <w:color w:val="FF0000"/>
-          <w:sz w:val="24"/>
-        </w:rPr>
-        <w:t>[CONFIRMAR COM O CLIENTE: prática de entrega de camisetas na empresa]</w:t>
-      </w:r>
-      <w:r>
-        <w:rPr>
-          <w:rFonts w:ascii="Times New Roman" w:hAnsi="Times New Roman" w:cs="Times New Roman"/>
-          <w:b w:val="0"/>
-          <w:i w:val="0"/>
-          <w:sz w:val="24"/>
-        </w:rPr>
-        <w:t>. Nenhuma das imagens tem data; nenhuma demonstra continuidade; nenhuma retrata o Autor trabalhando.</w:t>
+        <w:t>. A mera posse de uma peça de vestuário com identificação visual da empresa — que circula entre quem passa pelas frentes de serviço, inclusive prestadores pontuais e terceiros — não prova contratação, salário, jornada ou subordinação. Nenhuma das imagens tem data; nenhuma demonstra continuidade; nenhuma retrata o Autor trabalhando.</w:t>
       </w:r>
     </w:p>
     <w:p/>
@@ -2101,7 +2113,7 @@
           <w:i w:val="0"/>
           <w:sz w:val="24"/>
         </w:rPr>
-        <w:t>serviços determinados</w:t>
+        <w:t>serviços determinados, por empreitada ou tarefa</w:t>
       </w:r>
       <w:r>
         <w:rPr>
@@ -2119,7 +2131,7 @@
           <w:i w:val="0"/>
           <w:sz w:val="24"/>
         </w:rPr>
-        <w:t>por serviço executado</w:t>
+        <w:t>pelo serviço executado</w:t>
       </w:r>
       <w:r>
         <w:rPr>
@@ -2128,17 +2140,25 @@
           <w:i w:val="0"/>
           <w:sz w:val="24"/>
         </w:rPr>
-        <w:t xml:space="preserve"> — nunca por mês, nunca com salário fixo. </w:t>
+        <w:t xml:space="preserve"> — nunca por mês, nunca com salário fixo. Os pagamentos correspondentes são exatamente os que constam dos autos: </w:t>
+      </w:r>
+      <w:r>
+        <w:rPr>
+          <w:rFonts w:ascii="Times New Roman" w:hAnsi="Times New Roman" w:cs="Times New Roman"/>
+          <w:b/>
+          <w:i w:val="0"/>
+          <w:sz w:val="24"/>
+        </w:rPr>
+        <w:t>R$ 600,00 em 19/06/2026 e R$ 185,00 em 29/06/2026</w:t>
       </w:r>
       <w:r>
         <w:rPr>
           <w:rFonts w:ascii="Times New Roman" w:hAnsi="Times New Roman" w:cs="Times New Roman"/>
           <w:b w:val="0"/>
           <w:i w:val="0"/>
-          <w:color w:val="FF0000"/>
-          <w:sz w:val="24"/>
-        </w:rPr>
-        <w:t>[CONFIRMAR COM O CLIENTE E DESCREVER: quais serviços, em que obra(s), em que dias, e por que valores; relacionar TODOS os pagamentos feitos ao Reclamante, com data, valor e registro do sistema financeiro — doc. anexo — CONFIRMAR JUNTADA DO RELATÓRIO FINANCEIRO]</w:t>
+          <w:sz w:val="24"/>
+        </w:rPr>
+        <w:t xml:space="preserve"> (ID 866c5c6), cuja realização a Reclamada reconhece e cuja natureza — preço de serviço determinado, e não salário — os próprios valores e datas revelam.</w:t>
       </w:r>
     </w:p>
     <w:p/>
@@ -2488,17 +2508,7 @@
           <w:i w:val="0"/>
           <w:sz w:val="24"/>
         </w:rPr>
-        <w:t xml:space="preserve"> (ID 866c5c6, fl. 19). </w:t>
-      </w:r>
-      <w:r>
-        <w:rPr>
-          <w:rFonts w:ascii="Times New Roman" w:hAnsi="Times New Roman" w:cs="Times New Roman"/>
-          <w:b w:val="0"/>
-          <w:i w:val="0"/>
-          <w:color w:val="FF0000"/>
-          <w:sz w:val="24"/>
-        </w:rPr>
-        <w:t>[CONFIRMAR COM O CLIENTE: data do primeiro serviço prestado pelo Reclamante — se anterior a 19/06/2026, ajustar este item com base no relatório financeiro, sem negar pagamento documentado]</w:t>
+        <w:t xml:space="preserve"> (ID 866c5c6, fl. 19).</w:t>
       </w:r>
     </w:p>
     <w:p/>
@@ -2559,26 +2569,7 @@
           <w:i w:val="0"/>
           <w:sz w:val="24"/>
         </w:rPr>
-        <w:t xml:space="preserve"> na CCT da construção civil aplicável </w:t>
-      </w:r>
-      <w:r>
-        <w:rPr>
-          <w:rFonts w:ascii="Times New Roman" w:hAnsi="Times New Roman" w:cs="Times New Roman"/>
-          <w:b w:val="0"/>
-          <w:i w:val="0"/>
-          <w:color w:val="FF0000"/>
-          <w:sz w:val="24"/>
-        </w:rPr>
-        <w:t>[CONFERIR CCT VIGENTE EM 2026 E O PISO DO SERVENTE — CLÁUSULA]</w:t>
-      </w:r>
-      <w:r>
-        <w:rPr>
-          <w:rFonts w:ascii="Times New Roman" w:hAnsi="Times New Roman" w:cs="Times New Roman"/>
-          <w:b w:val="0"/>
-          <w:i w:val="0"/>
-          <w:sz w:val="24"/>
-        </w:rPr>
-        <w:t>, o que torna a alegação inverossímil para quem, segundo a própria inicial, trabalhava sem registro e sem qualquer formalidade.</w:t>
+        <w:t xml:space="preserve"> na CCT da construção civil aplicável (CCT anexa), o que torna a alegação inverossímil para quem, segundo a própria inicial, trabalhava sem registro e sem qualquer formalidade.</w:t>
       </w:r>
     </w:p>
     <w:p/>
@@ -2662,7 +2653,7 @@
           <w:i w:val="0"/>
           <w:sz w:val="24"/>
         </w:rPr>
-        <w:t xml:space="preserve"> para a data do primeiro serviço </w:t>
+        <w:t xml:space="preserve"> para </w:t>
       </w:r>
       <w:r>
         <w:rPr>
@@ -2671,6 +2662,24 @@
           <w:i w:val="0"/>
           <w:sz w:val="24"/>
         </w:rPr>
+        <w:t>19/06/2026</w:t>
+      </w:r>
+      <w:r>
+        <w:rPr>
+          <w:rFonts w:ascii="Times New Roman" w:hAnsi="Times New Roman" w:cs="Times New Roman"/>
+          <w:b w:val="0"/>
+          <w:i w:val="0"/>
+          <w:sz w:val="24"/>
+        </w:rPr>
+        <w:t xml:space="preserve">, data do primeiro serviço </w:t>
+      </w:r>
+      <w:r>
+        <w:rPr>
+          <w:rFonts w:ascii="Times New Roman" w:hAnsi="Times New Roman" w:cs="Times New Roman"/>
+          <w:b/>
+          <w:i w:val="0"/>
+          <w:sz w:val="24"/>
+        </w:rPr>
         <w:t>efetivamente comprovado</w:t>
       </w:r>
       <w:r>
@@ -2680,26 +2689,7 @@
           <w:i w:val="0"/>
           <w:sz w:val="24"/>
         </w:rPr>
-        <w:t xml:space="preserve"> nos autos — e não 12/01/2026, que nenhum elemento ampara —, com a consequente redução proporcional de todas as verbas </w:t>
-      </w:r>
-      <w:r>
-        <w:rPr>
-          <w:rFonts w:ascii="Times New Roman" w:hAnsi="Times New Roman" w:cs="Times New Roman"/>
-          <w:b w:val="0"/>
-          <w:i w:val="0"/>
-          <w:color w:val="FF0000"/>
-          <w:sz w:val="24"/>
-        </w:rPr>
-        <w:t>[CONFERIR DATA COM O RELATÓRIO FINANCEIRO DA EMPRESA]</w:t>
-      </w:r>
-      <w:r>
-        <w:rPr>
-          <w:rFonts w:ascii="Times New Roman" w:hAnsi="Times New Roman" w:cs="Times New Roman"/>
-          <w:b w:val="0"/>
-          <w:i w:val="0"/>
-          <w:sz w:val="24"/>
-        </w:rPr>
-        <w:t>;</w:t>
+        <w:t xml:space="preserve"> nos autos — e não 12/01/2026, que nenhum elemento ampara —, com a consequente redução proporcional de todas as verbas;</w:t>
       </w:r>
     </w:p>
     <w:p/>
@@ -2733,26 +2723,7 @@
           <w:i w:val="0"/>
           <w:sz w:val="24"/>
         </w:rPr>
-        <w:t xml:space="preserve"> previsto na CCT da construção civil aplicável </w:t>
-      </w:r>
-      <w:r>
-        <w:rPr>
-          <w:rFonts w:ascii="Times New Roman" w:hAnsi="Times New Roman" w:cs="Times New Roman"/>
-          <w:b w:val="0"/>
-          <w:i w:val="0"/>
-          <w:color w:val="FF0000"/>
-          <w:sz w:val="24"/>
-        </w:rPr>
-        <w:t>[CONFERIR CCT E CLÁUSULA]</w:t>
-      </w:r>
-      <w:r>
-        <w:rPr>
-          <w:rFonts w:ascii="Times New Roman" w:hAnsi="Times New Roman" w:cs="Times New Roman"/>
-          <w:b w:val="0"/>
-          <w:i w:val="0"/>
-          <w:sz w:val="24"/>
-        </w:rPr>
-        <w:t xml:space="preserve"> ou, na sua ausência, no </w:t>
+        <w:t xml:space="preserve"> previsto na CCT da construção civil aplicável (CCT anexa) ou, na sua ausência, no </w:t>
       </w:r>
       <w:r>
         <w:rPr>
@@ -2786,7 +2757,7 @@
           <w:i w:val="0"/>
           <w:sz w:val="24"/>
         </w:rPr>
-        <w:t xml:space="preserve">c) o reconhecimento de que, sendo o contrato inferior a 90 dias a partir da data comprovada, tratar-se-ia de </w:t>
+        <w:t xml:space="preserve">c) o reconhecimento de que, tendo o período comprovado (19/06/2026 a 13/07/2026) menos de 90 dias, tratar-se-ia, quando muito, de </w:t>
       </w:r>
       <w:r>
         <w:rPr>
@@ -2804,26 +2775,7 @@
           <w:i w:val="0"/>
           <w:sz w:val="24"/>
         </w:rPr>
-        <w:t xml:space="preserve">, com os efeitos próprios na extinção </w:t>
-      </w:r>
-      <w:r>
-        <w:rPr>
-          <w:rFonts w:ascii="Times New Roman" w:hAnsi="Times New Roman" w:cs="Times New Roman"/>
-          <w:b w:val="0"/>
-          <w:i w:val="0"/>
-          <w:color w:val="FF0000"/>
-          <w:sz w:val="24"/>
-        </w:rPr>
-        <w:t>[CONFERIR APÓS DEFINIR A DATA DE INÍCIO — só manter se o período comprovado for inferior a 90 dias]</w:t>
-      </w:r>
-      <w:r>
-        <w:rPr>
-          <w:rFonts w:ascii="Times New Roman" w:hAnsi="Times New Roman" w:cs="Times New Roman"/>
-          <w:b w:val="0"/>
-          <w:i w:val="0"/>
-          <w:sz w:val="24"/>
-        </w:rPr>
-        <w:t>;</w:t>
+        <w:t xml:space="preserve"> (art. 445, parágrafo único, da CLT), com os efeitos próprios na extinção;</w:t>
       </w:r>
     </w:p>
     <w:p/>
@@ -2857,26 +2809,7 @@
           <w:i w:val="0"/>
           <w:sz w:val="24"/>
         </w:rPr>
-        <w:t xml:space="preserve"> de todos os valores pagos ao Autor (art. 767 da CLT), inclusive os R$ 785,00 comprovados nos autos e os demais constantes do relatório financeiro da Reclamada </w:t>
-      </w:r>
-      <w:r>
-        <w:rPr>
-          <w:rFonts w:ascii="Times New Roman" w:hAnsi="Times New Roman" w:cs="Times New Roman"/>
-          <w:b w:val="0"/>
-          <w:i w:val="0"/>
-          <w:color w:val="FF0000"/>
-          <w:sz w:val="24"/>
-        </w:rPr>
-        <w:t>[doc. anexo — CONFIRMAR JUNTADA]</w:t>
-      </w:r>
-      <w:r>
-        <w:rPr>
-          <w:rFonts w:ascii="Times New Roman" w:hAnsi="Times New Roman" w:cs="Times New Roman"/>
-          <w:b w:val="0"/>
-          <w:i w:val="0"/>
-          <w:sz w:val="24"/>
-        </w:rPr>
-        <w:t>.</w:t>
+        <w:t xml:space="preserve"> de todos os valores pagos ao Autor (art. 767 da CLT), inclusive os R$ 785,00 comprovados nos autos (ID 866c5c6).</w:t>
       </w:r>
     </w:p>
     <w:p/>
@@ -3473,26 +3406,25 @@
           <w:i w:val="0"/>
           <w:sz w:val="24"/>
         </w:rPr>
-        <w:t xml:space="preserve">, redação da Lei nº 13.874/2019) </w:t>
+        <w:t xml:space="preserve">, redação da Lei nº 13.874/2019) (doc. anexo — quadro de pessoal no período). A presunção da </w:t>
+      </w:r>
+      <w:r>
+        <w:rPr>
+          <w:rFonts w:ascii="Times New Roman" w:hAnsi="Times New Roman" w:cs="Times New Roman"/>
+          <w:b/>
+          <w:i w:val="0"/>
+          <w:sz w:val="24"/>
+        </w:rPr>
+        <w:t>Súmula 338, I, do TST</w:t>
       </w:r>
       <w:r>
         <w:rPr>
           <w:rFonts w:ascii="Times New Roman" w:hAnsi="Times New Roman" w:cs="Times New Roman"/>
           <w:b w:val="0"/>
           <w:i w:val="0"/>
-          <w:color w:val="FF0000"/>
-          <w:sz w:val="24"/>
-        </w:rPr>
-        <w:t>[doc. anexo — CONFIRMAR JUNTADA DO QUADRO DE PESSOAL NO PERÍODO: folha/eSocial/CAGED/RAIS]</w:t>
-      </w:r>
-      <w:r>
-        <w:rPr>
-          <w:rFonts w:ascii="Times New Roman" w:hAnsi="Times New Roman" w:cs="Times New Roman"/>
-          <w:b w:val="0"/>
-          <w:i w:val="0"/>
-          <w:sz w:val="24"/>
-        </w:rPr>
-        <w:t xml:space="preserve">. A presunção da </w:t>
+          <w:sz w:val="24"/>
+        </w:rPr>
+        <w:t xml:space="preserve"> pressupõe o descumprimento de obrigação legal de controle que, no caso, </w:t>
       </w:r>
       <w:r>
         <w:rPr>
@@ -3501,44 +3433,7 @@
           <w:i w:val="0"/>
           <w:sz w:val="24"/>
         </w:rPr>
-        <w:t>Súmula 338, I, do TST</w:t>
-      </w:r>
-      <w:r>
-        <w:rPr>
-          <w:rFonts w:ascii="Times New Roman" w:hAnsi="Times New Roman" w:cs="Times New Roman"/>
-          <w:b w:val="0"/>
-          <w:i w:val="0"/>
-          <w:sz w:val="24"/>
-        </w:rPr>
-        <w:t xml:space="preserve"> pressupõe o descumprimento de obrigação legal de controle que, no caso, </w:t>
-      </w:r>
-      <w:r>
-        <w:rPr>
-          <w:rFonts w:ascii="Times New Roman" w:hAnsi="Times New Roman" w:cs="Times New Roman"/>
-          <w:b/>
-          <w:i w:val="0"/>
-          <w:sz w:val="24"/>
-        </w:rPr>
         <w:t>não existe</w:t>
-      </w:r>
-      <w:r>
-        <w:rPr>
-          <w:rFonts w:ascii="Times New Roman" w:hAnsi="Times New Roman" w:cs="Times New Roman"/>
-          <w:b w:val="0"/>
-          <w:i w:val="0"/>
-          <w:sz w:val="24"/>
-        </w:rPr>
-        <w:t xml:space="preserve"> </w:t>
-      </w:r>
-      <w:r>
-        <w:rPr>
-          <w:rFonts w:ascii="Times New Roman" w:hAnsi="Times New Roman" w:cs="Times New Roman"/>
-          <w:b w:val="0"/>
-          <w:i w:val="0"/>
-          <w:color w:val="FF0000"/>
-          <w:sz w:val="24"/>
-        </w:rPr>
-        <w:t>[CONFERIR: divergência entre o "mais de 10 empregados" do texto da Súmula 338, I, e os "20 trabalhadores" do art. 74, § 2º, da CLT — conferir a orientação atual do TRT-4]</w:t>
       </w:r>
       <w:r>
         <w:rPr>
@@ -3863,26 +3758,7 @@
           <w:i w:val="0"/>
           <w:sz w:val="24"/>
         </w:rPr>
-        <w:t xml:space="preserve"> nas demais parcelas, sob pena de *bis in idem* </w:t>
-      </w:r>
-      <w:r>
-        <w:rPr>
-          <w:rFonts w:ascii="Times New Roman" w:hAnsi="Times New Roman" w:cs="Times New Roman"/>
-          <w:b w:val="0"/>
-          <w:i w:val="0"/>
-          <w:color w:val="FF0000"/>
-          <w:sz w:val="24"/>
-        </w:rPr>
-        <w:t>[CONFERIR: OJ 394 da SBDI-1 do TST — redação vigente e modulação temporal aplicável ao período]</w:t>
-      </w:r>
-      <w:r>
-        <w:rPr>
-          <w:rFonts w:ascii="Times New Roman" w:hAnsi="Times New Roman" w:cs="Times New Roman"/>
-          <w:b w:val="0"/>
-          <w:i w:val="0"/>
-          <w:sz w:val="24"/>
-        </w:rPr>
-        <w:t>; (v) exclusão do reflexo em aviso prévio, se reconhecido o pedido de demissão (item IV.2); e (vi) dedução do que se comprovar pago.</w:t>
+        <w:t xml:space="preserve"> nas demais parcelas, sob pena de *bis in idem* (OJ 394 da SBDI-1 do TST); (v) exclusão do reflexo em aviso prévio, se reconhecido o pedido de demissão (item IV.2); e (vi) dedução do que se comprovar pago.</w:t>
       </w:r>
     </w:p>
     <w:p/>
@@ -3914,17 +3790,7 @@
           <w:i w:val="0"/>
           <w:sz w:val="24"/>
         </w:rPr>
-        <w:t xml:space="preserve">Improcedente. Não havia salário mensal, e portanto não há "saldo" de salário mensal. Os serviços prestados foram remunerados por serviço, como demonstram os comprovantes do próprio Autor. </w:t>
-      </w:r>
-      <w:r>
-        <w:rPr>
-          <w:rFonts w:ascii="Times New Roman" w:hAnsi="Times New Roman" w:cs="Times New Roman"/>
-          <w:b w:val="0"/>
-          <w:i w:val="0"/>
-          <w:color w:val="FF0000"/>
-          <w:sz w:val="24"/>
-        </w:rPr>
-        <w:t>[CONFIRMAR COM O CLIENTE: se há algum serviço prestado e ainda não pago — se houver, reconhecer e quitar/consignar, sem prejuízo da tese]</w:t>
+        <w:t>Improcedente. Não havia salário mensal, e portanto não há "saldo" de salário mensal. Os serviços prestados foram remunerados por empreitada/tarefa, e integralmente quitados, como demonstram os comprovantes do próprio Autor.</w:t>
       </w:r>
     </w:p>
     <w:p/>
@@ -4530,26 +4396,7 @@
           <w:i w:val="0"/>
           <w:sz w:val="24"/>
         </w:rPr>
-        <w:t xml:space="preserve">, e não admite "reflexo" ou "incidência" de horas extras como parcela autônoma. A rubrica duplica a multa e é puro *bis in idem*. Subsidiariamente, a multa deve limitar-se a um único salário-base, no valor normativo ou mínimo reconhecido </w:t>
-      </w:r>
-      <w:r>
-        <w:rPr>
-          <w:rFonts w:ascii="Times New Roman" w:hAnsi="Times New Roman" w:cs="Times New Roman"/>
-          <w:b w:val="0"/>
-          <w:i w:val="0"/>
-          <w:color w:val="FF0000"/>
-          <w:sz w:val="24"/>
-        </w:rPr>
-        <w:t>[CONFERIR: Súmula 33 do TRT-4 — teor e vigência, considerando a Súmula 462 do TST invocada pelo Autor]</w:t>
-      </w:r>
-      <w:r>
-        <w:rPr>
-          <w:rFonts w:ascii="Times New Roman" w:hAnsi="Times New Roman" w:cs="Times New Roman"/>
-          <w:b w:val="0"/>
-          <w:i w:val="0"/>
-          <w:sz w:val="24"/>
-        </w:rPr>
-        <w:t>.</w:t>
+        <w:t>, e não admite "reflexo" ou "incidência" de horas extras como parcela autônoma. A rubrica duplica a multa e é puro *bis in idem*. Subsidiariamente, a multa deve limitar-se a um único salário-base, no valor normativo ou mínimo reconhecido.</w:t>
       </w:r>
     </w:p>
     <w:p/>
@@ -4599,26 +4446,7 @@
           <w:i w:val="0"/>
           <w:sz w:val="24"/>
         </w:rPr>
-        <w:t xml:space="preserve">, hipótese que não gera direito ao benefício (art. 3º da Lei nº 7.998/1990 — dispensa sem justa causa); e (iii) o Autor não demonstra o preenchimento dos requisitos legais de carência para a habilitação, sendo o alegado período de cerca de seis meses </w:t>
-      </w:r>
-      <w:r>
-        <w:rPr>
-          <w:rFonts w:ascii="Times New Roman" w:hAnsi="Times New Roman" w:cs="Times New Roman"/>
-          <w:b w:val="0"/>
-          <w:i w:val="0"/>
-          <w:color w:val="FF0000"/>
-          <w:sz w:val="24"/>
-        </w:rPr>
-        <w:t>[CONFERIR: requisito de meses trabalhados para a 1ª solicitação — art. 3º, I, da Lei nº 7.998/1990, redação da Lei nº 13.134/2015]</w:t>
-      </w:r>
-      <w:r>
-        <w:rPr>
-          <w:rFonts w:ascii="Times New Roman" w:hAnsi="Times New Roman" w:cs="Times New Roman"/>
-          <w:b w:val="0"/>
-          <w:i w:val="0"/>
-          <w:sz w:val="24"/>
-        </w:rPr>
-        <w:t xml:space="preserve">. Subsidiariamente, eventual condenação deve limitar-se à </w:t>
+        <w:t xml:space="preserve">, hipótese que não gera direito ao benefício (art. 3º da Lei nº 7.998/1990 — dispensa sem justa causa); e (iii) o Autor não demonstra o preenchimento dos requisitos legais de carência para a habilitação, sendo certo que nem o período alegado (cerca de seis meses), nem muito menos o período comprovado (menos de um mês), atende à carência exigida para a primeira solicitação (art. 3º, I, "a", da Lei nº 7.998/1990, redação da Lei nº 13.134/2015). Subsidiariamente, eventual condenação deve limitar-se à </w:t>
       </w:r>
       <w:r>
         <w:rPr>
@@ -4738,26 +4566,7 @@
           <w:i w:val="0"/>
           <w:sz w:val="24"/>
         </w:rPr>
-        <w:t xml:space="preserve">, inclusive na procedência parcial (art. 791-A, § 3º, da CLT), com exigibilidade suspensa caso deferida a gratuidade </w:t>
-      </w:r>
-      <w:r>
-        <w:rPr>
-          <w:rFonts w:ascii="Times New Roman" w:hAnsi="Times New Roman" w:cs="Times New Roman"/>
-          <w:b w:val="0"/>
-          <w:i w:val="0"/>
-          <w:color w:val="FF0000"/>
-          <w:sz w:val="24"/>
-        </w:rPr>
-        <w:t>[CONFERIR: ADI 5766 — extensão da tese]</w:t>
-      </w:r>
-      <w:r>
-        <w:rPr>
-          <w:rFonts w:ascii="Times New Roman" w:hAnsi="Times New Roman" w:cs="Times New Roman"/>
-          <w:b w:val="0"/>
-          <w:i w:val="0"/>
-          <w:sz w:val="24"/>
-        </w:rPr>
-        <w:t>.</w:t>
+        <w:t>, inclusive na procedência parcial (art. 791-A, § 3º, da CLT), com exigibilidade suspensa caso deferida a gratuidade, na forma decidida pelo STF na ADI 5766.</w:t>
       </w:r>
     </w:p>
     <w:p/>
@@ -4789,26 +4598,7 @@
           <w:i w:val="0"/>
           <w:sz w:val="24"/>
         </w:rPr>
-        <w:t xml:space="preserve">Impugnam-se os critérios adotados no relatório de cálculo, que se refere a "última taxa relativa a 31/07/2025" e a "juros simples TRD". Eventual atualização deverá observar rigorosamente o regime vigente para o período </w:t>
-      </w:r>
-      <w:r>
-        <w:rPr>
-          <w:rFonts w:ascii="Times New Roman" w:hAnsi="Times New Roman" w:cs="Times New Roman"/>
-          <w:b w:val="0"/>
-          <w:i w:val="0"/>
-          <w:color w:val="FF0000"/>
-          <w:sz w:val="24"/>
-        </w:rPr>
-        <w:t>[CONFERIR: ADCs 58 e 59 do STF e alteração legislativa posterior]</w:t>
-      </w:r>
-      <w:r>
-        <w:rPr>
-          <w:rFonts w:ascii="Times New Roman" w:hAnsi="Times New Roman" w:cs="Times New Roman"/>
-          <w:b w:val="0"/>
-          <w:i w:val="0"/>
-          <w:sz w:val="24"/>
-        </w:rPr>
-        <w:t>, a ser definido em liquidação, com ressalva de impugnação.</w:t>
+        <w:t>Impugnam-se os critérios adotados no relatório de cálculo, que se refere a "última taxa relativa a 31/07/2025" e a "juros simples TRD". Eventual atualização deverá observar rigorosamente o regime vigente para o período (ADCs 58 e 59 do STF e legislação superveniente), a ser definido em liquidação, com ressalva de impugnação.</w:t>
       </w:r>
     </w:p>
     <w:p/>
@@ -4942,17 +4732,7 @@
           <w:i w:val="0"/>
           <w:sz w:val="24"/>
         </w:rPr>
-        <w:t xml:space="preserve"> (CloudWalk/InfinitePay) no período de 12/01/2026 a 13/07/2026, documento que só ele detém e que demonstrará a natureza, a frequência e os valores dos pagamentos que alega ter recebido. </w:t>
-      </w:r>
-      <w:r>
-        <w:rPr>
-          <w:rFonts w:ascii="Times New Roman" w:hAnsi="Times New Roman" w:cs="Times New Roman"/>
-          <w:b w:val="0"/>
-          <w:i w:val="0"/>
-          <w:color w:val="FF0000"/>
-          <w:sz w:val="24"/>
-        </w:rPr>
-        <w:t>[MANTER SOMENTE SE O RELATÓRIO FINANCEIRO DA EMPRESA CONFIRMAR QUE NÃO HOUVE PAGAMENTOS MENSAIS REGULARES AO RECLAMANTE — SE HOUVE, EXCLUIR ESTE PARÁGRAFO]</w:t>
+        <w:t xml:space="preserve"> (CloudWalk/InfinitePay) no período de 12/01/2026 a 13/07/2026, documento que só ele detém e que demonstrará a natureza, a frequência e os valores dos pagamentos que alega ter recebido.</w:t>
       </w:r>
     </w:p>
     <w:p/>
@@ -5551,26 +5331,7 @@
                 <w:i w:val="0"/>
                 <w:sz w:val="22"/>
               </w:rPr>
-              <w:t xml:space="preserve">, por acessoriedade; vedação do reflexo do RSR majorado </w:t>
-            </w:r>
-            <w:r>
-              <w:rPr>
-                <w:rFonts w:ascii="Times New Roman" w:hAnsi="Times New Roman" w:cs="Times New Roman"/>
-                <w:b w:val="0"/>
-                <w:i w:val="0"/>
-                <w:color w:val="FF0000"/>
-                <w:sz w:val="22"/>
-              </w:rPr>
-              <w:t>[CONFERIR OJ 394]</w:t>
-            </w:r>
-            <w:r>
-              <w:rPr>
-                <w:rFonts w:ascii="Times New Roman" w:hAnsi="Times New Roman" w:cs="Times New Roman"/>
-                <w:b w:val="0"/>
-                <w:i w:val="0"/>
-                <w:sz w:val="22"/>
-              </w:rPr>
-              <w:t>; reflexo em aviso indevido no pedido de demissão. Valores impugnados — item IV.3.5.</w:t>
+              <w:t>, por acessoriedade; vedação do reflexo do RSR majorado (OJ 394 da SBDI-1 do TST); reflexo em aviso indevido no pedido de demissão. Valores impugnados — item IV.3.5.</w:t>
             </w:r>
           </w:p>
         </w:tc>
@@ -6404,26 +6165,25 @@
           <w:i w:val="0"/>
           <w:sz w:val="24"/>
         </w:rPr>
-        <w:t xml:space="preserve">Em atenção ao despacho de ID 1491b01, a Reclamada </w:t>
+        <w:t xml:space="preserve">Em atenção ao despacho de ID 1491b01, a Reclamada informa que </w:t>
+      </w:r>
+      <w:r>
+        <w:rPr>
+          <w:rFonts w:ascii="Times New Roman" w:hAnsi="Times New Roman" w:cs="Times New Roman"/>
+          <w:b/>
+          <w:i w:val="0"/>
+          <w:sz w:val="24"/>
+        </w:rPr>
+        <w:t>não apresenta proposta conciliatória</w:t>
       </w:r>
       <w:r>
         <w:rPr>
           <w:rFonts w:ascii="Times New Roman" w:hAnsi="Times New Roman" w:cs="Times New Roman"/>
           <w:b w:val="0"/>
           <w:i w:val="0"/>
-          <w:color w:val="FF0000"/>
-          <w:sz w:val="24"/>
-        </w:rPr>
-        <w:t>[INFORMAR: apresenta proposta conciliatória de R$ ____ / não apresenta proposta neste momento, sem prejuízo de fazê-lo em audiência]</w:t>
-      </w:r>
-      <w:r>
-        <w:rPr>
-          <w:rFonts w:ascii="Times New Roman" w:hAnsi="Times New Roman" w:cs="Times New Roman"/>
-          <w:b w:val="0"/>
-          <w:i w:val="0"/>
-          <w:sz w:val="24"/>
-        </w:rPr>
-        <w:t>.</w:t>
+          <w:sz w:val="24"/>
+        </w:rPr>
+        <w:t>, diante da inexistência de vínculo de emprego e de qualquer valor devido ao Reclamante.</w:t>
       </w:r>
     </w:p>
     <w:p/>
@@ -6782,26 +6542,7 @@
           <w:i w:val="0"/>
           <w:sz w:val="24"/>
         </w:rPr>
-        <w:t xml:space="preserve"> no período alegado (arts. 396 e 400 do CPC) </w:t>
-      </w:r>
-      <w:r>
-        <w:rPr>
-          <w:rFonts w:ascii="Times New Roman" w:hAnsi="Times New Roman" w:cs="Times New Roman"/>
-          <w:b w:val="0"/>
-          <w:i w:val="0"/>
-          <w:color w:val="FF0000"/>
-          <w:sz w:val="24"/>
-        </w:rPr>
-        <w:t>[MANTER CONFORME RESSALVA DO ITEM IV.13]</w:t>
-      </w:r>
-      <w:r>
-        <w:rPr>
-          <w:rFonts w:ascii="Times New Roman" w:hAnsi="Times New Roman" w:cs="Times New Roman"/>
-          <w:b w:val="0"/>
-          <w:i w:val="0"/>
-          <w:sz w:val="24"/>
-        </w:rPr>
-        <w:t>;</w:t>
+        <w:t xml:space="preserve"> no período alegado (arts. 396 e 400 do CPC);</w:t>
       </w:r>
     </w:p>
     <w:p/>
@@ -6817,61 +6558,7 @@
           <w:i w:val="0"/>
           <w:sz w:val="24"/>
         </w:rPr>
-        <w:t xml:space="preserve">h) o recebimento dos documentos que acompanham esta defesa: procuração e atos constitutivos; relatório financeiro de todos os pagamentos feitos ao Reclamante; comprovação do quadro de pessoal no período (folha/eSocial/CAGED/RAIS); CCT da construção civil vigente em 2026 </w:t>
-      </w:r>
-      <w:r>
-        <w:rPr>
-          <w:rFonts w:ascii="Times New Roman" w:hAnsi="Times New Roman" w:cs="Times New Roman"/>
-          <w:b w:val="0"/>
-          <w:i w:val="0"/>
-          <w:color w:val="FF0000"/>
-          <w:sz w:val="24"/>
-        </w:rPr>
-        <w:t>[doc. anexo — CONFIRMAR JUNTADA]</w:t>
-      </w:r>
-      <w:r>
-        <w:rPr>
-          <w:rFonts w:ascii="Times New Roman" w:hAnsi="Times New Roman" w:cs="Times New Roman"/>
-          <w:b w:val="0"/>
-          <w:i w:val="0"/>
-          <w:sz w:val="24"/>
-        </w:rPr>
-        <w:t>;</w:t>
-      </w:r>
-    </w:p>
-    <w:p/>
-    <w:p>
-      <w:pPr>
-        <w:ind w:firstLine="850"/>
-        <w:jc w:val="both"/>
-      </w:pPr>
-      <w:r>
-        <w:rPr>
-          <w:rFonts w:ascii="Times New Roman" w:hAnsi="Times New Roman" w:cs="Times New Roman"/>
-          <w:b w:val="0"/>
-          <w:i w:val="0"/>
-          <w:sz w:val="24"/>
-        </w:rPr>
-        <w:t xml:space="preserve">i) </w:t>
-      </w:r>
-      <w:r>
-        <w:rPr>
-          <w:rFonts w:ascii="Times New Roman" w:hAnsi="Times New Roman" w:cs="Times New Roman"/>
-          <w:b w:val="0"/>
-          <w:i w:val="0"/>
-          <w:color w:val="FF0000"/>
-          <w:sz w:val="24"/>
-        </w:rPr>
-        <w:t>[CONFIRMAR: prazo para juntada de carta de preposto, caso o sócio-administrador não compareça pessoalmente à audiência]</w:t>
-      </w:r>
-      <w:r>
-        <w:rPr>
-          <w:rFonts w:ascii="Times New Roman" w:hAnsi="Times New Roman" w:cs="Times New Roman"/>
-          <w:b w:val="0"/>
-          <w:i w:val="0"/>
-          <w:sz w:val="24"/>
-        </w:rPr>
-        <w:t>.</w:t>
+        <w:t>h) o recebimento dos documentos que acompanham esta defesa: procuração e atos constitutivos; carta de preposto; comprovação do quadro de pessoal no período (folha/eSocial/CAGED/RAIS); e CCT da construção civil vigente em 2026.</w:t>
       </w:r>
     </w:p>
     <w:p/>

</xml_diff>